<commit_message>
Semana 07: detalle del cálculo de porcentajes en el solucionario y hoja de estudiante sin soluciones
Co-Authored-By: Claude Sonnet 5.5 <noreply@anthropic.com>
Claude-Session: https://claude.ai/code/session_01Le1LnPXTHyUtSvm19b3RaS
</commit_message>
<xml_diff>
--- a/semana07/modelos/Modelo_de_Sustentacion_Semana7_DOCENTE.docx
+++ b/semana07/modelos/Modelo_de_Sustentacion_Semana7_DOCENTE.docx
@@ -945,7 +945,405 @@
           <w:rFonts w:ascii="Tahoma" w:hAnsi="Tahoma" w:cs="Tahoma"/>
           <w:sz w:val="24"/>
         </w:rPr>
-        <w:t>Valores relativos al pasar de s = 4 a s = 5: Wq −78.5%; costo de espera −78.5%; costo fijo +25.0%; costo total −18.4%.</w:t>
+        <w:t>Cómo se calcula el porcentaje (variación relativa). Paso 1: se toma como base el valor actual (s = 4), porque es la situación con la que se compara. Paso 2: se resta valor propuesta − valor actual (si da negativo la medida baja; si da positivo, sube). Paso 3: esa diferencia se divide entre la base y se multiplica por 100:</w:t>
+      </w:r>
+    </w:p>
+    <w:p>
+      <w:pPr>
+        <w:spacing w:after="40"/>
+      </w:pPr>
+      <w:r>
+        <w:rPr>
+          <w:rFonts w:ascii="Tahoma" w:hAnsi="Tahoma" w:cs="Tahoma"/>
+          <w:b/>
+          <w:color w:val="1F7A3D"/>
+          <w:sz w:val="24"/>
+        </w:rPr>
+        <w:t>Variación % = (valor propuesta − valor actual) ÷ valor actual × 100</w:t>
+      </w:r>
+    </w:p>
+    <w:p>
+      <w:pPr/>
+    </w:p>
+    <w:tbl>
+      <w:tblPr>
+        <w:tblStyle w:val="Tablaconcuadrcula"/>
+        <w:tblW w:type="auto" w:w="0"/>
+        <w:tblLook w:firstColumn="1" w:firstRow="1" w:lastColumn="0" w:lastRow="0" w:noHBand="0" w:noVBand="1" w:val="04A0"/>
+      </w:tblPr>
+      <w:tblGrid>
+        <w:gridCol w:w="2400"/>
+        <w:gridCol w:w="5800"/>
+        <w:gridCol w:w="2267"/>
+      </w:tblGrid>
+      <w:tr>
+        <w:tc>
+          <w:tcPr>
+            <w:tcW w:type="dxa" w:w="2400"/>
+            <w:shd w:val="clear" w:color="auto" w:fill="9E1218"/>
+          </w:tcPr>
+          <w:p>
+            <w:pPr>
+              <w:jc w:val="center"/>
+            </w:pPr>
+            <w:r>
+              <w:rPr>
+                <w:rFonts w:ascii="Tahoma" w:hAnsi="Tahoma" w:cs="Tahoma"/>
+                <w:b/>
+                <w:color w:val="FFFFFF"/>
+                <w:sz w:val="24"/>
+              </w:rPr>
+              <w:t>Medida</w:t>
+            </w:r>
+          </w:p>
+        </w:tc>
+        <w:tc>
+          <w:tcPr>
+            <w:tcW w:type="dxa" w:w="5800"/>
+            <w:shd w:val="clear" w:color="auto" w:fill="9E1218"/>
+          </w:tcPr>
+          <w:p>
+            <w:pPr>
+              <w:jc w:val="center"/>
+            </w:pPr>
+            <w:r>
+              <w:rPr>
+                <w:rFonts w:ascii="Tahoma" w:hAnsi="Tahoma" w:cs="Tahoma"/>
+                <w:b/>
+                <w:color w:val="FFFFFF"/>
+                <w:sz w:val="24"/>
+              </w:rPr>
+              <w:t>Cálculo con los valores del cuadro</w:t>
+            </w:r>
+          </w:p>
+        </w:tc>
+        <w:tc>
+          <w:tcPr>
+            <w:tcW w:type="dxa" w:w="2267"/>
+            <w:shd w:val="clear" w:color="auto" w:fill="9E1218"/>
+          </w:tcPr>
+          <w:p>
+            <w:pPr>
+              <w:jc w:val="center"/>
+            </w:pPr>
+            <w:r>
+              <w:rPr>
+                <w:rFonts w:ascii="Tahoma" w:hAnsi="Tahoma" w:cs="Tahoma"/>
+                <w:b/>
+                <w:color w:val="FFFFFF"/>
+                <w:sz w:val="24"/>
+              </w:rPr>
+              <w:t>Resultado</w:t>
+            </w:r>
+          </w:p>
+        </w:tc>
+      </w:tr>
+      <w:tr>
+        <w:tc>
+          <w:tcPr>
+            <w:tcW w:type="dxa" w:w="2400"/>
+          </w:tcPr>
+          <w:p>
+            <w:r>
+              <w:rPr>
+                <w:rFonts w:ascii="Tahoma" w:hAnsi="Tahoma" w:cs="Tahoma"/>
+                <w:sz w:val="24"/>
+              </w:rPr>
+              <w:t>Wq (min)</w:t>
+            </w:r>
+          </w:p>
+        </w:tc>
+        <w:tc>
+          <w:tcPr>
+            <w:tcW w:type="dxa" w:w="5800"/>
+          </w:tcPr>
+          <w:p>
+            <w:pPr>
+              <w:jc w:val="center"/>
+            </w:pPr>
+            <w:r>
+              <w:rPr>
+                <w:rFonts w:ascii="Tahoma" w:hAnsi="Tahoma" w:cs="Tahoma"/>
+                <w:sz w:val="24"/>
+              </w:rPr>
+              <w:t>(1.92 − 8.95) ÷ 8.95 × 100 = −7.03 ÷ 8.95 × 100</w:t>
+            </w:r>
+          </w:p>
+        </w:tc>
+        <w:tc>
+          <w:tcPr>
+            <w:tcW w:type="dxa" w:w="2267"/>
+          </w:tcPr>
+          <w:p>
+            <w:pPr>
+              <w:jc w:val="center"/>
+            </w:pPr>
+            <w:r>
+              <w:rPr>
+                <w:rFonts w:ascii="Tahoma" w:hAnsi="Tahoma" w:cs="Tahoma"/>
+                <w:sz w:val="24"/>
+              </w:rPr>
+              <w:t>−78.5%</w:t>
+            </w:r>
+          </w:p>
+        </w:tc>
+      </w:tr>
+      <w:tr>
+        <w:tc>
+          <w:tcPr>
+            <w:tcW w:type="dxa" w:w="2400"/>
+          </w:tcPr>
+          <w:p>
+            <w:r>
+              <w:rPr>
+                <w:rFonts w:ascii="Tahoma" w:hAnsi="Tahoma" w:cs="Tahoma"/>
+                <w:sz w:val="24"/>
+              </w:rPr>
+              <w:t>Lq (pacientes)</w:t>
+            </w:r>
+          </w:p>
+        </w:tc>
+        <w:tc>
+          <w:tcPr>
+            <w:tcW w:type="dxa" w:w="5800"/>
+          </w:tcPr>
+          <w:p>
+            <w:pPr>
+              <w:jc w:val="center"/>
+            </w:pPr>
+            <w:r>
+              <w:rPr>
+                <w:rFonts w:ascii="Tahoma" w:hAnsi="Tahoma" w:cs="Tahoma"/>
+                <w:sz w:val="24"/>
+              </w:rPr>
+              <w:t>(0.5130 − 2.3857) ÷ 2.3857 × 100 = −1.8727 ÷ 2.3857 × 100</w:t>
+            </w:r>
+          </w:p>
+        </w:tc>
+        <w:tc>
+          <w:tcPr>
+            <w:tcW w:type="dxa" w:w="2267"/>
+          </w:tcPr>
+          <w:p>
+            <w:pPr>
+              <w:jc w:val="center"/>
+            </w:pPr>
+            <w:r>
+              <w:rPr>
+                <w:rFonts w:ascii="Tahoma" w:hAnsi="Tahoma" w:cs="Tahoma"/>
+                <w:sz w:val="24"/>
+              </w:rPr>
+              <w:t>−78.5%</w:t>
+            </w:r>
+          </w:p>
+        </w:tc>
+      </w:tr>
+      <w:tr>
+        <w:tc>
+          <w:tcPr>
+            <w:tcW w:type="dxa" w:w="2400"/>
+          </w:tcPr>
+          <w:p>
+            <w:r>
+              <w:rPr>
+                <w:rFonts w:ascii="Tahoma" w:hAnsi="Tahoma" w:cs="Tahoma"/>
+                <w:sz w:val="24"/>
+              </w:rPr>
+              <w:t>Costo fijo mensual</w:t>
+            </w:r>
+          </w:p>
+        </w:tc>
+        <w:tc>
+          <w:tcPr>
+            <w:tcW w:type="dxa" w:w="5800"/>
+          </w:tcPr>
+          <w:p>
+            <w:pPr>
+              <w:jc w:val="center"/>
+            </w:pPr>
+            <w:r>
+              <w:rPr>
+                <w:rFonts w:ascii="Tahoma" w:hAnsi="Tahoma" w:cs="Tahoma"/>
+                <w:sz w:val="24"/>
+              </w:rPr>
+              <w:t>(16,500 − 13,200) ÷ 13,200 × 100 = 3,300 ÷ 13,200 × 100</w:t>
+            </w:r>
+          </w:p>
+        </w:tc>
+        <w:tc>
+          <w:tcPr>
+            <w:tcW w:type="dxa" w:w="2267"/>
+          </w:tcPr>
+          <w:p>
+            <w:pPr>
+              <w:jc w:val="center"/>
+            </w:pPr>
+            <w:r>
+              <w:rPr>
+                <w:rFonts w:ascii="Tahoma" w:hAnsi="Tahoma" w:cs="Tahoma"/>
+                <w:sz w:val="24"/>
+              </w:rPr>
+              <w:t>+25.0%</w:t>
+            </w:r>
+          </w:p>
+        </w:tc>
+      </w:tr>
+      <w:tr>
+        <w:tc>
+          <w:tcPr>
+            <w:tcW w:type="dxa" w:w="2400"/>
+          </w:tcPr>
+          <w:p>
+            <w:r>
+              <w:rPr>
+                <w:rFonts w:ascii="Tahoma" w:hAnsi="Tahoma" w:cs="Tahoma"/>
+                <w:sz w:val="24"/>
+              </w:rPr>
+              <w:t>Costo de espera mensual</w:t>
+            </w:r>
+          </w:p>
+        </w:tc>
+        <w:tc>
+          <w:tcPr>
+            <w:tcW w:type="dxa" w:w="5800"/>
+          </w:tcPr>
+          <w:p>
+            <w:pPr>
+              <w:jc w:val="center"/>
+            </w:pPr>
+            <w:r>
+              <w:rPr>
+                <w:rFonts w:ascii="Tahoma" w:hAnsi="Tahoma" w:cs="Tahoma"/>
+                <w:sz w:val="24"/>
+              </w:rPr>
+              <w:t>(2,052 − 9,543) ÷ 9,543 × 100 = −7,491 ÷ 9,543 × 100</w:t>
+            </w:r>
+          </w:p>
+        </w:tc>
+        <w:tc>
+          <w:tcPr>
+            <w:tcW w:type="dxa" w:w="2267"/>
+          </w:tcPr>
+          <w:p>
+            <w:pPr>
+              <w:jc w:val="center"/>
+            </w:pPr>
+            <w:r>
+              <w:rPr>
+                <w:rFonts w:ascii="Tahoma" w:hAnsi="Tahoma" w:cs="Tahoma"/>
+                <w:sz w:val="24"/>
+              </w:rPr>
+              <w:t>−78.5%</w:t>
+            </w:r>
+          </w:p>
+        </w:tc>
+      </w:tr>
+      <w:tr>
+        <w:tc>
+          <w:tcPr>
+            <w:tcW w:type="dxa" w:w="2400"/>
+          </w:tcPr>
+          <w:p>
+            <w:r>
+              <w:rPr>
+                <w:rFonts w:ascii="Tahoma" w:hAnsi="Tahoma" w:cs="Tahoma"/>
+                <w:sz w:val="24"/>
+              </w:rPr>
+              <w:t>Costo total mensual</w:t>
+            </w:r>
+          </w:p>
+        </w:tc>
+        <w:tc>
+          <w:tcPr>
+            <w:tcW w:type="dxa" w:w="5800"/>
+          </w:tcPr>
+          <w:p>
+            <w:pPr>
+              <w:jc w:val="center"/>
+            </w:pPr>
+            <w:r>
+              <w:rPr>
+                <w:rFonts w:ascii="Tahoma" w:hAnsi="Tahoma" w:cs="Tahoma"/>
+                <w:sz w:val="24"/>
+              </w:rPr>
+              <w:t>(18,552 − 22,743) ÷ 22,743 × 100 = −4,191 ÷ 22,743 × 100</w:t>
+            </w:r>
+          </w:p>
+        </w:tc>
+        <w:tc>
+          <w:tcPr>
+            <w:tcW w:type="dxa" w:w="2267"/>
+          </w:tcPr>
+          <w:p>
+            <w:pPr>
+              <w:jc w:val="center"/>
+            </w:pPr>
+            <w:r>
+              <w:rPr>
+                <w:rFonts w:ascii="Tahoma" w:hAnsi="Tahoma" w:cs="Tahoma"/>
+                <w:sz w:val="24"/>
+              </w:rPr>
+              <w:t>−18.4%</w:t>
+            </w:r>
+          </w:p>
+        </w:tc>
+      </w:tr>
+    </w:tbl>
+    <w:p>
+      <w:pPr/>
+    </w:p>
+    <w:p>
+      <w:pPr>
+        <w:spacing w:after="120"/>
+        <w:jc w:val="both"/>
+      </w:pPr>
+      <w:r>
+        <w:rPr>
+          <w:rFonts w:ascii="Tahoma" w:hAnsi="Tahoma" w:cs="Tahoma"/>
+          <w:sz w:val="24"/>
+        </w:rPr>
+        <w:t>Porcentajes respecto de la meta de espera (aquí la base es la meta de 6 minutos, no el valor actual): con s = 4, (8.95 − 6) ÷ 6 × 100 = 2.95 ÷ 6 × 100 ≈ +49%, es decir, se pasa de la meta en 2.95 minutos; con s = 5, (1.92 − 6) ÷ 6 × 100 = −4.08 ÷ 6 × 100 ≈ −68%, es decir, queda 68% por debajo del máximo permitido.</w:t>
+      </w:r>
+    </w:p>
+    <w:p>
+      <w:pPr>
+        <w:spacing w:after="120"/>
+        <w:jc w:val="both"/>
+      </w:pPr>
+      <w:r>
+        <w:rPr>
+          <w:rFonts w:ascii="Tahoma" w:hAnsi="Tahoma" w:cs="Tahoma"/>
+          <w:sz w:val="24"/>
+        </w:rPr>
+        <w:t>Magnitudes que ya son porcentajes: utilización de los operadores = ρ × 100 → s = 4: 0.800 × 100 = 80.0%; s = 5: 0.640 × 100 = 64.0%. Probabilidad de tener que esperar = P(espera) × 100 → s = 4: 0.596 × 100 = 59.6%; s = 5: 0.289 × 100 = 28.9%.</w:t>
+      </w:r>
+    </w:p>
+    <w:p>
+      <w:pPr>
+        <w:spacing w:after="120"/>
+        <w:jc w:val="both"/>
+      </w:pPr>
+      <w:r>
+        <w:rPr>
+          <w:rFonts w:ascii="Tahoma" w:hAnsi="Tahoma" w:cs="Tahoma"/>
+          <w:sz w:val="24"/>
+        </w:rPr>
+        <w:t>Peso de cada componente en el costo total = componente ÷ costo total × 100 (la base es el costo total de cada propuesta): s = 4: costo fijo 13,200 ÷ 22,743 × 100 = 58.0% y costo de espera 9,543 ÷ 22,743 × 100 = 42.0%; s = 5: costo fijo 16,500 ÷ 18,552 × 100 = 88.9% y costo de espera 2,052 ÷ 18,552 × 100 = 11.1%. Al contratar al quinto operador el costo deja de estar dominado por la espera y pasa a ser sobre todo costo fijo.</w:t>
+      </w:r>
+    </w:p>
+    <w:p>
+      <w:pPr>
+        <w:spacing w:after="120"/>
+        <w:jc w:val="both"/>
+      </w:pPr>
+      <w:r>
+        <w:rPr>
+          <w:rFonts w:ascii="Tahoma" w:hAnsi="Tahoma" w:cs="Tahoma"/>
+          <w:i/>
+          <w:color w:val="595959"/>
+          <w:sz w:val="24"/>
+        </w:rPr>
+        <w:t>Observaciones: (1) los porcentajes se calcularon con los valores que muestra el cuadro; con los valores sin redondear se obtiene el mismo resultado al decimal indicado. (2) El porcentaje depende de la base: el costo fijo sube 25.0% respecto de s = 4, pero volver de s = 5 a s = 4 lo bajaría solo 20.0%. (3) No confundir porcentaje con puntos porcentuales: ρ pasa de 80.0% a 64.0%, es decir, −16.0 puntos porcentuales, que equivalen a una variación relativa de (64.0 − 80.0) ÷ 80.0 × 100 = −20.0%.</w:t>
       </w:r>
     </w:p>
     <w:p>
@@ -1059,7 +1457,7 @@
           <w:color w:val="1F7A3D"/>
           <w:sz w:val="24"/>
         </w:rPr>
-        <w:t>La mejor propuesta es contratar al quinto operador (s = 5). Cumple las dos condiciones planteadas: el tiempo de espera baja de 8.95 a 1.92 minutos (con s = 4 se excede la meta en 2.95 minutos, 49% por encima de los 6 minutos exigidos; con s = 5 se cumple con holgura), y el costo total mensual baja de S/ 22,743 a S/ 18,552, es decir, un ahorro de S/ 4,191 al mes (18.4%). El ahorro ocurre porque, aunque el costo fijo sube en S/ 3,300 (25.0%) al pasar de 4 a 5 operadores, el costo de oportunidad por las horas de espera de los pacientes cae en S/ 7,491 (78.5%), una reducción más de dos veces mayor que el aumento del costo fijo. Además, no conviene ir más allá: con un sexto operador el costo total (S/ 20,381) volvería a superar al de s = 5 (S/ 18,552).</w:t>
+        <w:t>La mejor propuesta es contratar al quinto operador (s = 5). Cumple las dos condiciones planteadas: el tiempo de espera baja de 8.95 a 1.92 minutos (con s = 4 se excede la meta en 2.95 minutos, ≈49% por encima de los 6 minutos exigidos; con s = 5 se cumple con holgura), y el costo total mensual baja de S/ 22,743 a S/ 18,552, es decir, un ahorro de S/ 4,191 al mes (18.4%). El ahorro ocurre porque, aunque el costo fijo sube en S/ 3,300 (25.0%) al pasar de 4 a 5 operadores, el costo de oportunidad por las horas de espera de los pacientes cae en S/ 7,491 (78.5%), una reducción más de dos veces mayor que el aumento del costo fijo. Además, no conviene ir más allá: con un sexto operador el costo total (S/ 20,381) volvería a superar al de s = 5 (S/ 18,552).</w:t>
       </w:r>
     </w:p>
     <w:p>
@@ -1911,6 +2309,117 @@
     </w:p>
     <w:p>
       <w:pPr>
+        <w:spacing w:after="120"/>
+        <w:jc w:val="both"/>
+      </w:pPr>
+      <w:r>
+        <w:rPr>
+          <w:rFonts w:ascii="Tahoma" w:hAnsi="Tahoma" w:cs="Tahoma"/>
+          <w:sz w:val="24"/>
+        </w:rPr>
+        <w:t>Detalle de cómo se calculan los porcentajes (siempre hay que decir cuál es la base):</w:t>
+      </w:r>
+    </w:p>
+    <w:p>
+      <w:pPr>
+        <w:spacing w:after="40"/>
+      </w:pPr>
+      <w:r>
+        <w:rPr>
+          <w:rFonts w:ascii="Tahoma" w:hAnsi="Tahoma" w:cs="Tahoma"/>
+          <w:b/>
+          <w:color w:val="1F7A3D"/>
+          <w:sz w:val="24"/>
+        </w:rPr>
+        <w:t>Probabilidades: 0.45 = 45% y 0.55 = 55% (se multiplica por 100).</w:t>
+      </w:r>
+    </w:p>
+    <w:p>
+      <w:pPr>
+        <w:spacing w:after="40"/>
+      </w:pPr>
+      <w:r>
+        <w:rPr>
+          <w:rFonts w:ascii="Tahoma" w:hAnsi="Tahoma" w:cs="Tahoma"/>
+          <w:b/>
+          <w:color w:val="1F7A3D"/>
+          <w:sz w:val="24"/>
+        </w:rPr>
+        <w:t>Reducción del 35% de los ingresos: 0.35 × 170,000 = 59,500; 170,000 − 59,500 = 110,500 (equivale a 170,000 × 0.65).</w:t>
+      </w:r>
+    </w:p>
+    <w:p>
+      <w:pPr>
+        <w:spacing w:after="40"/>
+      </w:pPr>
+      <w:r>
+        <w:rPr>
+          <w:rFonts w:ascii="Tahoma" w:hAnsi="Tahoma" w:cs="Tahoma"/>
+          <w:b/>
+          <w:color w:val="1F7A3D"/>
+          <w:sz w:val="24"/>
+        </w:rPr>
+        <w:t>Diferencia de VE con base en la línea vegetariana: (53,500 − 42,275) ÷ 42,275 × 100 = 11,225 ÷ 42,275 × 100 = 26.6% (la carta criolla rinde 26.6% más).</w:t>
+      </w:r>
+    </w:p>
+    <w:p>
+      <w:pPr>
+        <w:spacing w:after="40"/>
+      </w:pPr>
+      <w:r>
+        <w:rPr>
+          <w:rFonts w:ascii="Tahoma" w:hAnsi="Tahoma" w:cs="Tahoma"/>
+          <w:b/>
+          <w:color w:val="1F7A3D"/>
+          <w:sz w:val="24"/>
+        </w:rPr>
+        <w:t>La misma diferencia con base en la carta criolla: 11,225 ÷ 53,500 × 100 = 21.0% (la línea vegetariana rinde 21.0% menos). Son dos porcentajes distintos porque cambia la base.</w:t>
+      </w:r>
+    </w:p>
+    <w:p>
+      <w:pPr>
+        <w:spacing w:after="40"/>
+      </w:pPr>
+      <w:r>
+        <w:rPr>
+          <w:rFonts w:ascii="Tahoma" w:hAnsi="Tahoma" w:cs="Tahoma"/>
+          <w:b/>
+          <w:color w:val="1F7A3D"/>
+          <w:sz w:val="24"/>
+        </w:rPr>
+        <w:t>Escenario favorable: (75,000 − 70,000) ÷ 70,000 × 100 = 5,000 ÷ 70,000 × 100 = +7.1%</w:t>
+      </w:r>
+    </w:p>
+    <w:p>
+      <w:pPr>
+        <w:spacing w:after="40"/>
+      </w:pPr>
+      <w:r>
+        <w:rPr>
+          <w:rFonts w:ascii="Tahoma" w:hAnsi="Tahoma" w:cs="Tahoma"/>
+          <w:b/>
+          <w:color w:val="1F7A3D"/>
+          <w:sz w:val="24"/>
+        </w:rPr>
+        <w:t>Escenario desfavorable: (15,500 − 40,000) ÷ 40,000 × 100 = −24,500 ÷ 40,000 × 100 = −61.3%</w:t>
+      </w:r>
+    </w:p>
+    <w:p>
+      <w:pPr>
+        <w:spacing w:after="40"/>
+      </w:pPr>
+      <w:r>
+        <w:rPr>
+          <w:rFonts w:ascii="Tahoma" w:hAnsi="Tahoma" w:cs="Tahoma"/>
+          <w:b/>
+          <w:color w:val="1F7A3D"/>
+          <w:sz w:val="24"/>
+        </w:rPr>
+        <w:t>Probabilidad de equilibrio p: p(70,000) + (1 − p)(40,000) = p(75,000) + (1 − p)(15,500)  →  40,000 + 30,000p = 15,500 + 59,500p  →  24,500 = 29,500p  →  p = 0.8305 = 83.1%.</w:t>
+      </w:r>
+    </w:p>
+    <w:p>
+      <w:pPr>
         <w:jc w:val="both"/>
       </w:pPr>
       <w:r>
@@ -2445,6 +2954,75 @@
           <w:sz w:val="24"/>
         </w:rPr>
         <w:t>La mejor estrategia es lanzar el servicio de telemedicina y, si hay baja aceptación, lanzar la campaña de descuentos. Su valor esperado neto (S/ 156,000) supera a la utilidad segura de continuar solo con el consultorio (S/ 140,000) en S/ 16,000 (11.4%). Comparando las tres estrategias completas: (1) continuar = S/ 140,000; (2) lanzar con campaña = S/ 156,000; (3) lanzar y cancelar si hay baja aceptación = 0.60(240,000) + 0.40(−20,000) − 40,000 = S/ 96,000. El recurso es lo que cambia la decisión: sin la campaña, lanzar valdría S/ 44,000 menos que continuar. Como criterio de riesgo, con la estrategia (2) hay una probabilidad de 20% de terminar con solo S/ 20,000 (campaña desfavorable, ya descontado el costo inicial), frente a la utilidad segura de S/ 140,000; con 80% de probabilidad se obtienen S/ 160,000 o más. Por eso se recomienda lanzar, aunque un dueño muy adverso al riesgo podría preferir la utilidad segura.</w:t>
+      </w:r>
+    </w:p>
+    <w:p>
+      <w:pPr>
+        <w:spacing w:after="120"/>
+        <w:jc w:val="both"/>
+      </w:pPr>
+      <w:r>
+        <w:rPr>
+          <w:rFonts w:ascii="Tahoma" w:hAnsi="Tahoma" w:cs="Tahoma"/>
+          <w:sz w:val="24"/>
+        </w:rPr>
+        <w:t>Detalle de cómo se calculan los porcentajes (siempre hay que decir cuál es la base):</w:t>
+      </w:r>
+    </w:p>
+    <w:p>
+      <w:pPr>
+        <w:spacing w:after="40"/>
+      </w:pPr>
+      <w:r>
+        <w:rPr>
+          <w:rFonts w:ascii="Tahoma" w:hAnsi="Tahoma" w:cs="Tahoma"/>
+          <w:b/>
+          <w:color w:val="1F7A3D"/>
+          <w:sz w:val="24"/>
+        </w:rPr>
+        <w:t>Ventaja de lanzar sobre continuar (base = utilidad segura): (156,000 − 140,000) ÷ 140,000 × 100 = 16,000 ÷ 140,000 × 100 = 11.4%</w:t>
+      </w:r>
+    </w:p>
+    <w:p>
+      <w:pPr>
+        <w:spacing w:after="40"/>
+      </w:pPr>
+      <w:r>
+        <w:rPr>
+          <w:rFonts w:ascii="Tahoma" w:hAnsi="Tahoma" w:cs="Tahoma"/>
+          <w:b/>
+          <w:color w:val="1F7A3D"/>
+          <w:sz w:val="24"/>
+        </w:rPr>
+        <w:t>Lanzar y cancelar frente a continuar: (96,000 − 140,000) ÷ 140,000 × 100 = −44,000 ÷ 140,000 × 100 = −31.4%</w:t>
+      </w:r>
+    </w:p>
+    <w:p>
+      <w:pPr>
+        <w:spacing w:after="40"/>
+      </w:pPr>
+      <w:r>
+        <w:rPr>
+          <w:rFonts w:ascii="Tahoma" w:hAnsi="Tahoma" w:cs="Tahoma"/>
+          <w:b/>
+          <w:color w:val="1F7A3D"/>
+          <w:sz w:val="24"/>
+        </w:rPr>
+        <w:t>Aporte del recurso: 156,000 − 96,000 = 60,000, que sobre la estrategia (3) es 60,000 ÷ 96,000 × 100 = 62.5%</w:t>
+      </w:r>
+    </w:p>
+    <w:p>
+      <w:pPr>
+        <w:spacing w:after="40"/>
+      </w:pPr>
+      <w:r>
+        <w:rPr>
+          <w:rFonts w:ascii="Tahoma" w:hAnsi="Tahoma" w:cs="Tahoma"/>
+          <w:b/>
+          <w:color w:val="1F7A3D"/>
+          <w:sz w:val="24"/>
+        </w:rPr>
+        <w:t>Probabilidad de cada resultado de la estrategia (2) = producto de las probabilidades de su rama: alta aceptación 0.60 = 60%; baja aceptación y respuesta favorable 0.40 × 0.50 = 0.20 = 20%; baja aceptación y respuesta desfavorable 0.40 × 0.50 = 0.20 = 20%. Suma: 100%.</w:t>
       </w:r>
     </w:p>
     <w:p>

</xml_diff>